<commit_message>
Systematize generation workflow and implement Gem指示書 rules
Code fixes (parse_notta.py):
- Add split_procedural_sequence: auto-inserts audience lines for 異議なし・質疑なし・各討論なし・賛成者起立
- Add PROCEDURAL_PATTERNS for all procedural sequences
- Add convert_kanji_agenda_num: 日程第一→日程第１ etc.
- Add KANJI_NUM_MAP for kanji-to-fullwidth-arabic conversion
- Enhanced agenda heading detection for long paragraphs

Workflow systematization:
- generate-minutes.md: Add Step 0 pre-checklist, mandatory Step 3 quality check, send-only-after-passing rule
- CLAUDE.md: Add standard generation flow, per-step responsibility table, prohibited actions list

Quality check results for 003:
- 発言者不明: 0件
- 日程見出し行: 46行
- 傍聴行: 16行（異議なし・質疑なし・討論なし・起立）
- フォーマット違反: 0件
- 半角文字混入: 0件

https://claude.ai/code/session_01DSXpxR9uSVvyY4tStJN8FT
</commit_message>
<xml_diff>
--- a/samples/003/output/minutes_draft.docx
+++ b/samples/003/output/minutes_draft.docx
@@ -1726,7 +1726,7 @@
           <w:rFonts w:ascii="ＭＳ 明朝" w:hAnsi="ＭＳ 明朝" w:eastAsia="ＭＳ 明朝" w:cs="ＭＳ 明朝"/>
           <w:sz w:val="21"/>
         </w:rPr>
-        <w:t xml:space="preserve">　ただいまから令和８年、椎葉村議会６月定例会を開催します。直ちに会議を開きます。本日の議事日程は、お手元に配布した通りであります。日程第一会議録署名議員の指名を行います。会議録署名議員は、会議規則第１２６条の規定により、９番那須重美議員、一番椎葉智成議員を指名します。</w:t>
+        <w:t xml:space="preserve">　ただいまから令和８年、椎葉村議会６月定例会を開催します。直ちに会議を開きます。本日の議事日程は、お手元に配布した通りであります。日程第１会議録署名議員の指名を行います。会議録署名議員は、会議規則第１２６条の規定により、９番那須重美議員、一番椎葉智成議員を指名します。</w:t>
       </w:r>
     </w:p>
     <w:p>
@@ -1745,7 +1745,20 @@
           <w:rFonts w:ascii="ＭＳ 明朝" w:hAnsi="ＭＳ 明朝" w:eastAsia="ＭＳ 明朝" w:cs="ＭＳ 明朝"/>
           <w:sz w:val="21"/>
         </w:rPr>
-        <w:t xml:space="preserve">　日程第二会期の決定を議題とします。おはかりします。本定例会の会期は、本日６月９日から６月１１日までの３日間、年３日間としたいと思います。これにご異議ありませんか？異議なしと認めます。したがって、会期は本日９日から１１日までの３日間に決定いたしました。</w:t>
+        <w:t xml:space="preserve">　日程第２会期の決定を議題とします。おはかりします。本定例会の会期は、本日６月９日から６月１１日までの３日間、年３日間としたいと思います。これにご異議ありませんか？</w:t>
+      </w:r>
+    </w:p>
+    <w:p>
+      <w:pPr>
+        <w:spacing w:after="0" w:before="0"/>
+        <w:jc w:val="center"/>
+      </w:pPr>
+      <w:r>
+        <w:rPr>
+          <w:rFonts w:ascii="ＭＳ 明朝" w:hAnsi="ＭＳ 明朝" w:eastAsia="ＭＳ 明朝" w:cs="ＭＳ 明朝"/>
+          <w:sz w:val="21"/>
+        </w:rPr>
+        <w:t>（「異議なし」と呼ぶ者あり）</w:t>
       </w:r>
     </w:p>
     <w:p>
@@ -1764,7 +1777,7 @@
           <w:rFonts w:ascii="ＭＳ 明朝" w:hAnsi="ＭＳ 明朝" w:eastAsia="ＭＳ 明朝" w:cs="ＭＳ 明朝"/>
           <w:sz w:val="21"/>
         </w:rPr>
-        <w:t xml:space="preserve">　日程第三諸般の報告を議題とします。初めに議長報告です。お手元に配布してあります。諸般の報告をもって、報告にかえさせていただきます。次に、本日までに受理した請願陳情は、お手元にお配りした請願陳情付託表のとおりであり、総務文教常任委員会に付託しましたので、報告します。</w:t>
+        <w:t xml:space="preserve">　異議なしと認めます。したがって、会期は本日９日から１１日までの３日間に決定いたしました。</w:t>
       </w:r>
     </w:p>
     <w:p>
@@ -1783,6 +1796,25 @@
           <w:rFonts w:ascii="ＭＳ 明朝" w:hAnsi="ＭＳ 明朝" w:eastAsia="ＭＳ 明朝" w:cs="ＭＳ 明朝"/>
           <w:sz w:val="21"/>
         </w:rPr>
+        <w:t xml:space="preserve">　日程第３諸般の報告を議題とします。初めに議長報告です。お手元に配布してあります。諸般の報告をもって、報告にかえさせていただきます。次に、本日までに受理した請願陳情は、お手元にお配りした請願陳情付託表のとおりであり、総務文教常任委員会に付託しましたので、報告します。</w:t>
+      </w:r>
+    </w:p>
+    <w:p>
+      <w:pPr>
+        <w:spacing w:after="0" w:before="0"/>
+      </w:pPr>
+      <w:r>
+        <w:rPr>
+          <w:rFonts w:ascii="ＭＳ ゴシック" w:hAnsi="ＭＳ ゴシック" w:eastAsia="ＭＳ ゴシック" w:cs="ＭＳ ゴシック"/>
+          <w:sz w:val="21"/>
+        </w:rPr>
+        <w:t>〇議長（岡村　正司君）</w:t>
+      </w:r>
+      <w:r>
+        <w:rPr>
+          <w:rFonts w:ascii="ＭＳ 明朝" w:hAnsi="ＭＳ 明朝" w:eastAsia="ＭＳ 明朝" w:cs="ＭＳ 明朝"/>
+          <w:sz w:val="21"/>
+        </w:rPr>
         <w:t xml:space="preserve">　朗読は省略します。次に、委員会報告です。総務文教常任委員会から、報告書の提出がありました。お手元にお配りした委員会報告をもって、報告にかえさせていただきます。朗読は省略します。次に、地方自治法第２３０五条の二第三項の規定により、令和８年２月から令和８年４月までの例月水と検索結果について、監査委員から報告がありましたので、その写しをお手元に配布しております。</w:t>
       </w:r>
     </w:p>
@@ -2011,7 +2043,7 @@
           <w:rFonts w:ascii="ＭＳ 明朝" w:hAnsi="ＭＳ 明朝" w:eastAsia="ＭＳ 明朝" w:cs="ＭＳ 明朝"/>
           <w:sz w:val="21"/>
         </w:rPr>
-        <w:t xml:space="preserve">　質疑なしと認めます。これにて報告済みといたします。以上で、諸般の報告を終わります。日程第五一般質問を行います。通告順に従っては、発言を許可します。２番藏座二九生議員の登壇を求めます。この質問は、制限時間を７０分とし、一問一答方式で行います。</w:t>
+        <w:t xml:space="preserve">　質疑なしと認めます。これにて報告済みといたします。以上で、諸般の報告を終わります。日程第５一般質問を行います。通告順に従っては、発言を許可します。２番藏座二九生議員の登壇を求めます。この質問は、制限時間を７０分とし、一問一答方式で行います。</w:t>
       </w:r>
     </w:p>
     <w:p>
@@ -5982,7 +6014,7 @@
           <w:rFonts w:ascii="ＭＳ 明朝" w:hAnsi="ＭＳ 明朝" w:eastAsia="ＭＳ 明朝" w:cs="ＭＳ 明朝"/>
           <w:sz w:val="21"/>
         </w:rPr>
-        <w:t xml:space="preserve">　よろしくお願いいたします。以上以上をもちまして、質問を終わりたいと思います。以上で、９番那須重美議員の質問を終わります。日程第五同位、第２号椎葉村農業委員会委員の任命につき、同意を求めることについてと、日程第六同位、第３号椎葉村農業委員会委員の任命につき、同意を求めることについてと、日程第七、同位第４号椎葉村農業委員会委員の任命につき、同意を求めることについてと、日程第八同意第５号椎葉村農業委員会委員の任命につき同意を求めることについてと日程第九、同位第６号椎葉村農業委員会の農業委員会委員の任命につき、同意を求めることについてと、日程第１０同位、第７号椎葉村農業委員会委員の任命につき、同意を求めることについてと、日程第１１同位、第８号椎葉村農業委員会委員の任命につき、同意を求めることについてと、日程第１２、同意第９号椎葉村農業委員会委員の任命につき、同意を求めることについてと、日程第１３同位、第１０号椎葉村農業委員会委員の任命につき、同意を求めることについてと、日程第１４同位、第１１号、椎葉村農業委員会委員の任命につき、同意を求めることについての以上、１０議案を一括議題とします。</w:t>
+        <w:t xml:space="preserve">　よろしくお願いいたします。以上以上をもちまして、質問を終わりたいと思います。以上で、９番那須重美議員の質問を終わります。日程第５同位、第２号椎葉村農業委員会委員の任命につき、同意を求めることについてと、日程第６同位、第３号椎葉村農業委員会委員の任命につき、同意を求めることについてと、日程第７、同位第４号椎葉村農業委員会委員の任命につき、同意を求めることについてと、日程第８同意第５号椎葉村農業委員会委員の任命につき同意を求めることについてと日程第９、同位第６号椎葉村農業委員会の農業委員会委員の任命につき、同意を求めることについてと、日程第１０同位、第７号椎葉村農業委員会委員の任命につき、同意を求めることについてと、日程第１１同位、第８号椎葉村農業委員会委員の任命につき、同意を求めることについてと、日程第１２、同意第９号椎葉村農業委員会委員の任命につき、同意を求めることについてと、日程第１３同位、第１０号椎葉村農業委員会委員の任命につき、同意を求めることについてと、日程第１４同位、第１１号、椎葉村農業委員会委員の任命につき、同意を求めることについての以上、１０議案を一括議題とします。</w:t>
       </w:r>
     </w:p>
     <w:p>
@@ -6077,7 +6109,20 @@
           <w:rFonts w:ascii="ＭＳ 明朝" w:hAnsi="ＭＳ 明朝" w:eastAsia="ＭＳ 明朝" w:cs="ＭＳ 明朝"/>
           <w:sz w:val="21"/>
         </w:rPr>
-        <w:t xml:space="preserve">　以上の重議案については、一括して質疑を行います。質疑はありませんか？質疑なしと認めます。これから、逐次討論、採決を行います。まず、同意。第２号椎葉村農業委員会委員の任命につき、同意を求めることについて討論を行います。</w:t>
+        <w:t xml:space="preserve">　以上の重議案については、一括して質疑を行います。質疑はありませんか？</w:t>
+      </w:r>
+    </w:p>
+    <w:p>
+      <w:pPr>
+        <w:spacing w:after="0" w:before="0"/>
+        <w:jc w:val="center"/>
+      </w:pPr>
+      <w:r>
+        <w:rPr>
+          <w:rFonts w:ascii="ＭＳ 明朝" w:hAnsi="ＭＳ 明朝" w:eastAsia="ＭＳ 明朝" w:cs="ＭＳ 明朝"/>
+          <w:sz w:val="21"/>
+        </w:rPr>
+        <w:t>（「質疑なし」と呼ぶ者あり）</w:t>
       </w:r>
     </w:p>
     <w:p>
@@ -6096,6 +6141,25 @@
           <w:rFonts w:ascii="ＭＳ 明朝" w:hAnsi="ＭＳ 明朝" w:eastAsia="ＭＳ 明朝" w:cs="ＭＳ 明朝"/>
           <w:sz w:val="21"/>
         </w:rPr>
+        <w:t xml:space="preserve">　質疑なしと認めます。これから、逐次討論、採決を行います。まず、同意。第２号椎葉村農業委員会委員の任命につき、同意を求めることについて討論を行います。</w:t>
+      </w:r>
+    </w:p>
+    <w:p>
+      <w:pPr>
+        <w:spacing w:after="0" w:before="0"/>
+      </w:pPr>
+      <w:r>
+        <w:rPr>
+          <w:rFonts w:ascii="ＭＳ ゴシック" w:hAnsi="ＭＳ ゴシック" w:eastAsia="ＭＳ ゴシック" w:cs="ＭＳ ゴシック"/>
+          <w:sz w:val="21"/>
+        </w:rPr>
+        <w:t>〇議長（岡村　正司君）</w:t>
+      </w:r>
+      <w:r>
+        <w:rPr>
+          <w:rFonts w:ascii="ＭＳ 明朝" w:hAnsi="ＭＳ 明朝" w:eastAsia="ＭＳ 明朝" w:cs="ＭＳ 明朝"/>
+          <w:sz w:val="21"/>
+        </w:rPr>
         <w:t xml:space="preserve">　討論はありませんか？討論なしと認めます。これから採決を行います。本案に賛成の方は</w:t>
       </w:r>
     </w:p>
@@ -6147,7 +6211,20 @@
           <w:rFonts w:ascii="ＭＳ 明朝" w:hAnsi="ＭＳ 明朝" w:eastAsia="ＭＳ 明朝" w:cs="ＭＳ 明朝"/>
           <w:sz w:val="21"/>
         </w:rPr>
-        <w:t xml:space="preserve">　次に同意。第３号椎葉村農業委員会委員の任命につき、同意を求めることにについて、討論を行います。討論はありませんか？討論なしと認めます。これから採決を行います。本案に賛成の方はご起立願います。ご着席ください。</w:t>
+        <w:t xml:space="preserve">　次に同意。第３号椎葉村農業委員会委員の任命につき、同意を求めることにについて、討論を行います。討論はありませんか？</w:t>
+      </w:r>
+    </w:p>
+    <w:p>
+      <w:pPr>
+        <w:spacing w:after="0" w:before="0"/>
+        <w:jc w:val="center"/>
+      </w:pPr>
+      <w:r>
+        <w:rPr>
+          <w:rFonts w:ascii="ＭＳ 明朝" w:hAnsi="ＭＳ 明朝" w:eastAsia="ＭＳ 明朝" w:cs="ＭＳ 明朝"/>
+          <w:sz w:val="21"/>
+        </w:rPr>
+        <w:t>（「討論なし」と呼ぶ者あり）</w:t>
       </w:r>
     </w:p>
     <w:p>
@@ -6166,6 +6243,25 @@
           <w:rFonts w:ascii="ＭＳ 明朝" w:hAnsi="ＭＳ 明朝" w:eastAsia="ＭＳ 明朝" w:cs="ＭＳ 明朝"/>
           <w:sz w:val="21"/>
         </w:rPr>
+        <w:t xml:space="preserve">　討論なしと認めます。これから採決を行います。本案に賛成の方はご起立願います。ご着席ください。</w:t>
+      </w:r>
+    </w:p>
+    <w:p>
+      <w:pPr>
+        <w:spacing w:after="0" w:before="0"/>
+      </w:pPr>
+      <w:r>
+        <w:rPr>
+          <w:rFonts w:ascii="ＭＳ ゴシック" w:hAnsi="ＭＳ ゴシック" w:eastAsia="ＭＳ ゴシック" w:cs="ＭＳ ゴシック"/>
+          <w:sz w:val="21"/>
+        </w:rPr>
+        <w:t>〇議長（岡村　正司君）</w:t>
+      </w:r>
+      <w:r>
+        <w:rPr>
+          <w:rFonts w:ascii="ＭＳ 明朝" w:hAnsi="ＭＳ 明朝" w:eastAsia="ＭＳ 明朝" w:cs="ＭＳ 明朝"/>
+          <w:sz w:val="21"/>
+        </w:rPr>
         <w:t xml:space="preserve">　起立全員であります。したがって、同意さ第３号椎葉村農業委員会委員の任命につき、同意を求めることについては、原案の通り、同意することに決定しました。次に、同意。第４号椎葉村農業委員会委員の任命につき、同意を求めることについて討論を行います。</w:t>
       </w:r>
     </w:p>
@@ -6236,7 +6332,20 @@
           <w:rFonts w:ascii="ＭＳ 明朝" w:hAnsi="ＭＳ 明朝" w:eastAsia="ＭＳ 明朝" w:cs="ＭＳ 明朝"/>
           <w:sz w:val="21"/>
         </w:rPr>
-        <w:t xml:space="preserve">　次に、同意。第５号椎葉村農業委員会委員の任命につき、同意を求めることについて討論を行います。討論はありませんか？討論なしと認めます。これから採決を行います。本案に賛成の方はご起立願います。ご着席ください。</w:t>
+        <w:t xml:space="preserve">　次に、同意。第５号椎葉村農業委員会委員の任命につき、同意を求めることについて討論を行います。討論はありませんか？</w:t>
+      </w:r>
+    </w:p>
+    <w:p>
+      <w:pPr>
+        <w:spacing w:after="0" w:before="0"/>
+        <w:jc w:val="center"/>
+      </w:pPr>
+      <w:r>
+        <w:rPr>
+          <w:rFonts w:ascii="ＭＳ 明朝" w:hAnsi="ＭＳ 明朝" w:eastAsia="ＭＳ 明朝" w:cs="ＭＳ 明朝"/>
+          <w:sz w:val="21"/>
+        </w:rPr>
+        <w:t>（「討論なし」と呼ぶ者あり）</w:t>
       </w:r>
     </w:p>
     <w:p>
@@ -6255,6 +6364,25 @@
           <w:rFonts w:ascii="ＭＳ 明朝" w:hAnsi="ＭＳ 明朝" w:eastAsia="ＭＳ 明朝" w:cs="ＭＳ 明朝"/>
           <w:sz w:val="21"/>
         </w:rPr>
+        <w:t xml:space="preserve">　討論なしと認めます。これから採決を行います。本案に賛成の方はご起立願います。ご着席ください。</w:t>
+      </w:r>
+    </w:p>
+    <w:p>
+      <w:pPr>
+        <w:spacing w:after="0" w:before="0"/>
+      </w:pPr>
+      <w:r>
+        <w:rPr>
+          <w:rFonts w:ascii="ＭＳ ゴシック" w:hAnsi="ＭＳ ゴシック" w:eastAsia="ＭＳ ゴシック" w:cs="ＭＳ ゴシック"/>
+          <w:sz w:val="21"/>
+        </w:rPr>
+        <w:t>〇議長（岡村　正司君）</w:t>
+      </w:r>
+      <w:r>
+        <w:rPr>
+          <w:rFonts w:ascii="ＭＳ 明朝" w:hAnsi="ＭＳ 明朝" w:eastAsia="ＭＳ 明朝" w:cs="ＭＳ 明朝"/>
+          <w:sz w:val="21"/>
+        </w:rPr>
         <w:t xml:space="preserve">　起立全員であります。したがって、同意第５号椎葉村農業委員会委員の任命につき、同意を求めることについては、原案の通り、同意することに決定しました。次に、同意。第６号椎葉村農業委員会委員の任命につき、同意を求めることについて討論を行います。</w:t>
       </w:r>
     </w:p>
@@ -6274,7 +6402,20 @@
           <w:rFonts w:ascii="ＭＳ 明朝" w:hAnsi="ＭＳ 明朝" w:eastAsia="ＭＳ 明朝" w:cs="ＭＳ 明朝"/>
           <w:sz w:val="21"/>
         </w:rPr>
-        <w:t xml:space="preserve">　討論はありませんか？討論なしと認めます。これから採決を行います。本案に賛成の方は御議立願います。ご着席ください。起立全員であります。従って、第同意第６号椎葉村農業委員会委員の任命につき、同意を求めることについては、原案の通り同意することに決定しました。</w:t>
+        <w:t xml:space="preserve">　討論はありませんか？</w:t>
+      </w:r>
+    </w:p>
+    <w:p>
+      <w:pPr>
+        <w:spacing w:after="0" w:before="0"/>
+        <w:jc w:val="center"/>
+      </w:pPr>
+      <w:r>
+        <w:rPr>
+          <w:rFonts w:ascii="ＭＳ 明朝" w:hAnsi="ＭＳ 明朝" w:eastAsia="ＭＳ 明朝" w:cs="ＭＳ 明朝"/>
+          <w:sz w:val="21"/>
+        </w:rPr>
+        <w:t>（「討論なし」と呼ぶ者あり）</w:t>
       </w:r>
     </w:p>
     <w:p>
@@ -6293,7 +6434,7 @@
           <w:rFonts w:ascii="ＭＳ 明朝" w:hAnsi="ＭＳ 明朝" w:eastAsia="ＭＳ 明朝" w:cs="ＭＳ 明朝"/>
           <w:sz w:val="21"/>
         </w:rPr>
-        <w:t xml:space="preserve">　次に同意。第７号椎葉村農業委員会委員の任命につき、同意を求めることについて討論を行います。討論はありませんか？討論なしと認めます。これから採決を行います。本案に賛成の方はご起立願います。ご着席ください。</w:t>
+        <w:t xml:space="preserve">　討論なしと認めます。これから採決を行います。本案に賛成の方は御議立願います。ご着席ください。起立全員であります。従って、第同意第６号椎葉村農業委員会委員の任命につき、同意を求めることについては、原案の通り同意することに決定しました。</w:t>
       </w:r>
     </w:p>
     <w:p>
@@ -6312,6 +6453,57 @@
           <w:rFonts w:ascii="ＭＳ 明朝" w:hAnsi="ＭＳ 明朝" w:eastAsia="ＭＳ 明朝" w:cs="ＭＳ 明朝"/>
           <w:sz w:val="21"/>
         </w:rPr>
+        <w:t xml:space="preserve">　次に同意。第７号椎葉村農業委員会委員の任命につき、同意を求めることについて討論を行います。討論はありませんか？</w:t>
+      </w:r>
+    </w:p>
+    <w:p>
+      <w:pPr>
+        <w:spacing w:after="0" w:before="0"/>
+        <w:jc w:val="center"/>
+      </w:pPr>
+      <w:r>
+        <w:rPr>
+          <w:rFonts w:ascii="ＭＳ 明朝" w:hAnsi="ＭＳ 明朝" w:eastAsia="ＭＳ 明朝" w:cs="ＭＳ 明朝"/>
+          <w:sz w:val="21"/>
+        </w:rPr>
+        <w:t>（「討論なし」と呼ぶ者あり）</w:t>
+      </w:r>
+    </w:p>
+    <w:p>
+      <w:pPr>
+        <w:spacing w:after="0" w:before="0"/>
+      </w:pPr>
+      <w:r>
+        <w:rPr>
+          <w:rFonts w:ascii="ＭＳ ゴシック" w:hAnsi="ＭＳ ゴシック" w:eastAsia="ＭＳ ゴシック" w:cs="ＭＳ ゴシック"/>
+          <w:sz w:val="21"/>
+        </w:rPr>
+        <w:t>〇議長（岡村　正司君）</w:t>
+      </w:r>
+      <w:r>
+        <w:rPr>
+          <w:rFonts w:ascii="ＭＳ 明朝" w:hAnsi="ＭＳ 明朝" w:eastAsia="ＭＳ 明朝" w:cs="ＭＳ 明朝"/>
+          <w:sz w:val="21"/>
+        </w:rPr>
+        <w:t xml:space="preserve">　討論なしと認めます。これから採決を行います。本案に賛成の方はご起立願います。ご着席ください。</w:t>
+      </w:r>
+    </w:p>
+    <w:p>
+      <w:pPr>
+        <w:spacing w:after="0" w:before="0"/>
+      </w:pPr>
+      <w:r>
+        <w:rPr>
+          <w:rFonts w:ascii="ＭＳ ゴシック" w:hAnsi="ＭＳ ゴシック" w:eastAsia="ＭＳ ゴシック" w:cs="ＭＳ ゴシック"/>
+          <w:sz w:val="21"/>
+        </w:rPr>
+        <w:t>〇議長（岡村　正司君）</w:t>
+      </w:r>
+      <w:r>
+        <w:rPr>
+          <w:rFonts w:ascii="ＭＳ 明朝" w:hAnsi="ＭＳ 明朝" w:eastAsia="ＭＳ 明朝" w:cs="ＭＳ 明朝"/>
+          <w:sz w:val="21"/>
+        </w:rPr>
         <w:t xml:space="preserve">　起立全員であります。従って、同意第７号椎葉村農業委員会委員の任命につき、同意を求めることについては、原案の通り同意することに決定しました。次に、同位第８号椎葉村農業委員会委員の任命につき、同意を求め求めることについて討論を行います。</w:t>
       </w:r>
     </w:p>
@@ -6382,7 +6574,20 @@
           <w:rFonts w:ascii="ＭＳ 明朝" w:hAnsi="ＭＳ 明朝" w:eastAsia="ＭＳ 明朝" w:cs="ＭＳ 明朝"/>
           <w:sz w:val="21"/>
         </w:rPr>
-        <w:t xml:space="preserve">　次に、同意。第９号椎葉村農業委員会委員の任命につき、同意を求めることについて討論を行います。討論はありませんか？討論なしと認めます。これから採決を行います。本案に賛成の方はご起立願います。ご着席ください。</w:t>
+        <w:t xml:space="preserve">　次に、同意。第９号椎葉村農業委員会委員の任命につき、同意を求めることについて討論を行います。討論はありませんか？</w:t>
+      </w:r>
+    </w:p>
+    <w:p>
+      <w:pPr>
+        <w:spacing w:after="0" w:before="0"/>
+        <w:jc w:val="center"/>
+      </w:pPr>
+      <w:r>
+        <w:rPr>
+          <w:rFonts w:ascii="ＭＳ 明朝" w:hAnsi="ＭＳ 明朝" w:eastAsia="ＭＳ 明朝" w:cs="ＭＳ 明朝"/>
+          <w:sz w:val="21"/>
+        </w:rPr>
+        <w:t>（「討論なし」と呼ぶ者あり）</w:t>
       </w:r>
     </w:p>
     <w:p>
@@ -6401,6 +6606,25 @@
           <w:rFonts w:ascii="ＭＳ 明朝" w:hAnsi="ＭＳ 明朝" w:eastAsia="ＭＳ 明朝" w:cs="ＭＳ 明朝"/>
           <w:sz w:val="21"/>
         </w:rPr>
+        <w:t xml:space="preserve">　討論なしと認めます。これから採決を行います。本案に賛成の方はご起立願います。ご着席ください。</w:t>
+      </w:r>
+    </w:p>
+    <w:p>
+      <w:pPr>
+        <w:spacing w:after="0" w:before="0"/>
+      </w:pPr>
+      <w:r>
+        <w:rPr>
+          <w:rFonts w:ascii="ＭＳ ゴシック" w:hAnsi="ＭＳ ゴシック" w:eastAsia="ＭＳ ゴシック" w:cs="ＭＳ ゴシック"/>
+          <w:sz w:val="21"/>
+        </w:rPr>
+        <w:t>〇議長（岡村　正司君）</w:t>
+      </w:r>
+      <w:r>
+        <w:rPr>
+          <w:rFonts w:ascii="ＭＳ 明朝" w:hAnsi="ＭＳ 明朝" w:eastAsia="ＭＳ 明朝" w:cs="ＭＳ 明朝"/>
+          <w:sz w:val="21"/>
+        </w:rPr>
         <w:t xml:space="preserve">　起立全員であります。したがって、同位第９号椎葉村農業委員会委員の任命につき、同意を求めることについては、原案の通り、同意することに決定しました。次に、同意。第１０号椎葉村農業委員会委員の任命につき、同意を求めることについて討論を行います。</w:t>
       </w:r>
     </w:p>
@@ -6471,7 +6695,20 @@
           <w:rFonts w:ascii="ＭＳ 明朝" w:hAnsi="ＭＳ 明朝" w:eastAsia="ＭＳ 明朝" w:cs="ＭＳ 明朝"/>
           <w:sz w:val="21"/>
         </w:rPr>
-        <w:t xml:space="preserve">　次に、同意。第１１号椎葉村農業委員会委員の任命につき、同意を求めることについて討論を行います。討論はありませんか？討論なしと認めます。これから採決を行います。本案に賛成の方はご起立願います。ご着席ください。</w:t>
+        <w:t xml:space="preserve">　次に、同意。第１１号椎葉村農業委員会委員の任命につき、同意を求めることについて討論を行います。討論はありませんか？</w:t>
+      </w:r>
+    </w:p>
+    <w:p>
+      <w:pPr>
+        <w:spacing w:after="0" w:before="0"/>
+        <w:jc w:val="center"/>
+      </w:pPr>
+      <w:r>
+        <w:rPr>
+          <w:rFonts w:ascii="ＭＳ 明朝" w:hAnsi="ＭＳ 明朝" w:eastAsia="ＭＳ 明朝" w:cs="ＭＳ 明朝"/>
+          <w:sz w:val="21"/>
+        </w:rPr>
+        <w:t>（「討論なし」と呼ぶ者あり）</w:t>
       </w:r>
     </w:p>
     <w:p>
@@ -6490,6 +6727,25 @@
           <w:rFonts w:ascii="ＭＳ 明朝" w:hAnsi="ＭＳ 明朝" w:eastAsia="ＭＳ 明朝" w:cs="ＭＳ 明朝"/>
           <w:sz w:val="21"/>
         </w:rPr>
+        <w:t xml:space="preserve">　討論なしと認めます。これから採決を行います。本案に賛成の方はご起立願います。ご着席ください。</w:t>
+      </w:r>
+    </w:p>
+    <w:p>
+      <w:pPr>
+        <w:spacing w:after="0" w:before="0"/>
+      </w:pPr>
+      <w:r>
+        <w:rPr>
+          <w:rFonts w:ascii="ＭＳ ゴシック" w:hAnsi="ＭＳ ゴシック" w:eastAsia="ＭＳ ゴシック" w:cs="ＭＳ ゴシック"/>
+          <w:sz w:val="21"/>
+        </w:rPr>
+        <w:t>〇議長（岡村　正司君）</w:t>
+      </w:r>
+      <w:r>
+        <w:rPr>
+          <w:rFonts w:ascii="ＭＳ 明朝" w:hAnsi="ＭＳ 明朝" w:eastAsia="ＭＳ 明朝" w:cs="ＭＳ 明朝"/>
+          <w:sz w:val="21"/>
+        </w:rPr>
         <w:t xml:space="preserve">　起立全員であります。したがって、同意第１１号椎葉村農業委員会委員の任命につき、同意を求めることについては、原案の通り、同意することに決定しました。日程第１０１５、議案第３１号令和８年度、椎葉村一般会計補正予算第１号についてを議題いたします。</w:t>
       </w:r>
     </w:p>
@@ -7459,7 +7715,20 @@
           <w:rFonts w:ascii="ＭＳ 明朝" w:hAnsi="ＭＳ 明朝" w:eastAsia="ＭＳ 明朝" w:cs="ＭＳ 明朝"/>
           <w:sz w:val="21"/>
         </w:rPr>
-        <w:t xml:space="preserve">　以上に、議案については、一括して質疑を行います。質疑はありませんか？質疑なしと認めます。</w:t>
+        <w:t xml:space="preserve">　以上に、議案については、一括して質疑を行います。質疑はありませんか？</w:t>
+      </w:r>
+    </w:p>
+    <w:p>
+      <w:pPr>
+        <w:spacing w:after="0" w:before="0"/>
+        <w:jc w:val="center"/>
+      </w:pPr>
+      <w:r>
+        <w:rPr>
+          <w:rFonts w:ascii="ＭＳ 明朝" w:hAnsi="ＭＳ 明朝" w:eastAsia="ＭＳ 明朝" w:cs="ＭＳ 明朝"/>
+          <w:sz w:val="21"/>
+        </w:rPr>
+        <w:t>（「質疑なし」と呼ぶ者あり）</w:t>
       </w:r>
     </w:p>
     <w:p>
@@ -7478,7 +7747,7 @@
           <w:rFonts w:ascii="ＭＳ 明朝" w:hAnsi="ＭＳ 明朝" w:eastAsia="ＭＳ 明朝" w:cs="ＭＳ 明朝"/>
           <w:sz w:val="21"/>
         </w:rPr>
-        <w:t xml:space="preserve">　これから逐次討論を討論採決を行います。まず、議案第３７号村道路線の廃止について討論を行います。討論はありませんか？討論なしと認めます。これから採決を行います。本案に賛成の方はご起立願います。ご着席選びますください。</w:t>
+        <w:t xml:space="preserve">　質疑なしと認めます。</w:t>
       </w:r>
     </w:p>
     <w:p>
@@ -7497,7 +7766,90 @@
           <w:rFonts w:ascii="ＭＳ 明朝" w:hAnsi="ＭＳ 明朝" w:eastAsia="ＭＳ 明朝" w:cs="ＭＳ 明朝"/>
           <w:sz w:val="21"/>
         </w:rPr>
-        <w:t xml:space="preserve">　起立全員であります。従って、議案第３７号村道路線の廃止については、原案の通り可決されました。次に、議案第３８号ソ同路線の認定について討論を行います。討論はありませんか？討論なしと認めます。これから採決を行います。</w:t>
+        <w:t xml:space="preserve">　これから逐次討論を討論採決を行います。まず、議案第３７号村道路線の廃止について討論を行います。討論はありませんか？</w:t>
+      </w:r>
+    </w:p>
+    <w:p>
+      <w:pPr>
+        <w:spacing w:after="0" w:before="0"/>
+        <w:jc w:val="center"/>
+      </w:pPr>
+      <w:r>
+        <w:rPr>
+          <w:rFonts w:ascii="ＭＳ 明朝" w:hAnsi="ＭＳ 明朝" w:eastAsia="ＭＳ 明朝" w:cs="ＭＳ 明朝"/>
+          <w:sz w:val="21"/>
+        </w:rPr>
+        <w:t>（「討論なし」と呼ぶ者あり）</w:t>
+      </w:r>
+    </w:p>
+    <w:p>
+      <w:pPr>
+        <w:spacing w:after="0" w:before="0"/>
+      </w:pPr>
+      <w:r>
+        <w:rPr>
+          <w:rFonts w:ascii="ＭＳ ゴシック" w:hAnsi="ＭＳ ゴシック" w:eastAsia="ＭＳ ゴシック" w:cs="ＭＳ ゴシック"/>
+          <w:sz w:val="21"/>
+        </w:rPr>
+        <w:t>〇議長（岡村　正司君）</w:t>
+      </w:r>
+      <w:r>
+        <w:rPr>
+          <w:rFonts w:ascii="ＭＳ 明朝" w:hAnsi="ＭＳ 明朝" w:eastAsia="ＭＳ 明朝" w:cs="ＭＳ 明朝"/>
+          <w:sz w:val="21"/>
+        </w:rPr>
+        <w:t xml:space="preserve">　討論なしと認めます。これから採決を行います。本案に賛成の方はご起立願います。ご着席選びますください。</w:t>
+      </w:r>
+    </w:p>
+    <w:p>
+      <w:pPr>
+        <w:spacing w:after="0" w:before="0"/>
+      </w:pPr>
+      <w:r>
+        <w:rPr>
+          <w:rFonts w:ascii="ＭＳ ゴシック" w:hAnsi="ＭＳ ゴシック" w:eastAsia="ＭＳ ゴシック" w:cs="ＭＳ ゴシック"/>
+          <w:sz w:val="21"/>
+        </w:rPr>
+        <w:t>〇議長（岡村　正司君）</w:t>
+      </w:r>
+      <w:r>
+        <w:rPr>
+          <w:rFonts w:ascii="ＭＳ 明朝" w:hAnsi="ＭＳ 明朝" w:eastAsia="ＭＳ 明朝" w:cs="ＭＳ 明朝"/>
+          <w:sz w:val="21"/>
+        </w:rPr>
+        <w:t xml:space="preserve">　起立全員であります。従って、議案第３７号村道路線の廃止については、原案の通り可決されました。次に、議案第３８号ソ同路線の認定について討論を行います。討論はありませんか？</w:t>
+      </w:r>
+    </w:p>
+    <w:p>
+      <w:pPr>
+        <w:spacing w:after="0" w:before="0"/>
+        <w:jc w:val="center"/>
+      </w:pPr>
+      <w:r>
+        <w:rPr>
+          <w:rFonts w:ascii="ＭＳ 明朝" w:hAnsi="ＭＳ 明朝" w:eastAsia="ＭＳ 明朝" w:cs="ＭＳ 明朝"/>
+          <w:sz w:val="21"/>
+        </w:rPr>
+        <w:t>（「討論なし」と呼ぶ者あり）</w:t>
+      </w:r>
+    </w:p>
+    <w:p>
+      <w:pPr>
+        <w:spacing w:after="0" w:before="0"/>
+      </w:pPr>
+      <w:r>
+        <w:rPr>
+          <w:rFonts w:ascii="ＭＳ ゴシック" w:hAnsi="ＭＳ ゴシック" w:eastAsia="ＭＳ ゴシック" w:cs="ＭＳ ゴシック"/>
+          <w:sz w:val="21"/>
+        </w:rPr>
+        <w:t>〇議長（岡村　正司君）</w:t>
+      </w:r>
+      <w:r>
+        <w:rPr>
+          <w:rFonts w:ascii="ＭＳ 明朝" w:hAnsi="ＭＳ 明朝" w:eastAsia="ＭＳ 明朝" w:cs="ＭＳ 明朝"/>
+          <w:sz w:val="21"/>
+        </w:rPr>
+        <w:t xml:space="preserve">　討論なしと認めます。これから採決を行います。</w:t>
       </w:r>
     </w:p>
     <w:p>

</xml_diff>